<commit_message>
complete backend CRUD and freeze Stage 9 API contract
</commit_message>
<xml_diff>
--- a/docs/Metro_Rail_Smart_Card_Management_System_Database_Design.docx
+++ b/docs/Metro_Rail_Smart_Card_Management_System_Database_Design.docx
@@ -605,10 +605,9 @@
           <w:p>
             <w:r>
               <w:rPr>
-                <w:rFonts w:ascii="Times New Roman" w:hAnsi="Times New Roman"/>
-                <w:sz w:val="17"/>
+                <w:sz w:val="18"/>
               </w:rPr>
-              <w:t>VARCHAR(4)</w:t>
+              <w:t>VARCHAR(5)</w:t>
             </w:r>
           </w:p>
         </w:tc>
@@ -649,12 +648,9 @@
           <w:p>
             <w:r>
               <w:rPr>
-                <w:rFonts w:ascii="Times New Roman" w:hAnsi="Times New Roman"/>
-                <w:b w:val="0"/>
-                <w:color w:val="000000"/>
-                <w:sz w:val="17"/>
+                <w:sz w:val="18"/>
               </w:rPr>
-              <w:t>International dialing code such as +91, +1, +44</w:t>
+              <w:t>International dialing code such as +91, +1, +44, +971</w:t>
             </w:r>
           </w:p>
         </w:tc>
@@ -4663,7 +4659,7 @@
           <w:rFonts w:ascii="Times New Roman" w:hAnsi="Times New Roman"/>
           <w:sz w:val="21"/>
         </w:rPr>
-        <w:t>The international country code is stored separately and must begin with + followed by 1 to 3 digits. The mobile number contains only digits. The total phone number, excluding the + symbol, is limited to 15 digits.</w:t>
+        <w:t>The international country code is stored separately and must begin with + followed by 1 to 4 digits. The mobile number contains only digits. The total phone number, excluding the + symbol, is limited to 15 digits.</w:t>
       </w:r>
     </w:p>
     <w:p>
@@ -4745,14 +4741,16 @@
               <w:br/>
               <w:t xml:space="preserve">    passenger_name VARCHAR(100) NOT NULL,</w:t>
               <w:br/>
-              <w:t xml:space="preserve">    country_code VARCHAR(4) NOT NULL,</w:t>
+              <w:br/>
+              <w:t xml:space="preserve">    country_code VARCHAR(5) NOT NULL,</w:t>
               <w:br/>
               <w:t xml:space="preserve">    mobile_number VARCHAR(14) NOT NULL,</w:t>
+              <w:br/>
               <w:br/>
               <w:t xml:space="preserve">    email VARCHAR(100),</w:t>
               <w:br/>
               <w:br/>
-              <w:t xml:space="preserve">    CHECK (country_code REGEXP '^[+][1-9][0-9]{0,2}$'),</w:t>
+              <w:t xml:space="preserve">    CHECK (country_code REGEXP '^\\+[1-9][0-9]{0,3}$'),</w:t>
               <w:br/>
               <w:t xml:space="preserve">    CHECK (mobile_number REGEXP '^[0-9]{4,14}$'),</w:t>
               <w:br/>
@@ -4783,9 +4781,9 @@
               <w:t xml:space="preserve">        REFERENCES Passengers(passenger_id),</w:t>
               <w:br/>
               <w:br/>
-              <w:t xml:space="preserve">    CHECK (card_number REGEXP '^METRO[0-9]{4}$'),</w:t>
+              <w:t xml:space="preserve">    CHECK (balance &gt;= 0),</w:t>
               <w:br/>
-              <w:t xml:space="preserve">    CHECK (balance &gt;= 0)</w:t>
+              <w:t xml:space="preserve">    CHECK (card_number REGEXP '^METRO[0-9]{4}$')</w:t>
               <w:br/>
               <w:t>);</w:t>
               <w:br/>

</xml_diff>